<commit_message>
Update disciplinary templates 02-04 and 06-12
</commit_message>
<xml_diff>
--- a/02 - Sanción Notificación Inicio Expediente.docx
+++ b/02 - Sanción Notificación Inicio Expediente.docx
@@ -796,13 +796,6 @@
         </w:rPr>
         <w:t>: JOSÉ MANUEL RODRÍGUEZ GARCÍA</w:t>
       </w:r>
-    </w:p>
-    <w:p>
-      <w:pPr>
-        <w:tabs>
-          <w:tab w:val="left" w:pos="3609"/>
-        </w:tabs>
-      </w:pPr>
     </w:p>
     <w:p>
       <w:pPr>
@@ -1999,6 +1992,25 @@
 </file>
 
 <file path=customXml/item1.xml><?xml version="1.0" encoding="utf-8"?>
+<?mso-contentType ?>
+<FormTemplates xmlns="http://schemas.microsoft.com/sharepoint/v3/contenttype/forms">
+  <Display>DocumentLibraryForm</Display>
+  <Edit>DocumentLibraryForm</Edit>
+  <New>DocumentLibraryForm</New>
+</FormTemplates>
+</file>
+
+<file path=customXml/item2.xml><?xml version="1.0" encoding="utf-8"?>
+<p:properties xmlns:p="http://schemas.microsoft.com/office/2006/metadata/properties" xmlns:xsi="http://www.w3.org/2001/XMLSchema-instance" xmlns:pc="http://schemas.microsoft.com/office/infopath/2007/PartnerControls">
+  <documentManagement>
+    <lcf76f155ced4ddcb4097134ff3c332f xmlns="c8a3e049-7505-4416-9a92-b091f6792637">
+      <Terms xmlns="http://schemas.microsoft.com/office/infopath/2007/PartnerControls"/>
+    </lcf76f155ced4ddcb4097134ff3c332f>
+  </documentManagement>
+</p:properties>
+</file>
+
+<file path=customXml/item3.xml><?xml version="1.0" encoding="utf-8"?>
 <ct:contentTypeSchema xmlns:ct="http://schemas.microsoft.com/office/2006/metadata/contentType" xmlns:ma="http://schemas.microsoft.com/office/2006/metadata/properties/metaAttributes" ct:_="" ma:_="" ma:contentTypeName="Documento" ma:contentTypeID="0x010100BE5E44177913B140848DC48051328551" ma:contentTypeVersion="10" ma:contentTypeDescription="Crear nuevo documento." ma:contentTypeScope="" ma:versionID="e56293935e30344837f372b4cf6c3dd2">
   <xsd:schema xmlns:xsd="http://www.w3.org/2001/XMLSchema" xmlns:xs="http://www.w3.org/2001/XMLSchema" xmlns:p="http://schemas.microsoft.com/office/2006/metadata/properties" xmlns:ns2="c8a3e049-7505-4416-9a92-b091f6792637" targetNamespace="http://schemas.microsoft.com/office/2006/metadata/properties" ma:root="true" ma:fieldsID="dd180e20af6143d6ed5990269d1f6a3c" ns2:_="">
     <xsd:import namespace="c8a3e049-7505-4416-9a92-b091f6792637"/>
@@ -2176,26 +2188,25 @@
 </ct:contentTypeSchema>
 </file>
 
-<file path=customXml/item2.xml><?xml version="1.0" encoding="utf-8"?>
-<p:properties xmlns:p="http://schemas.microsoft.com/office/2006/metadata/properties" xmlns:xsi="http://www.w3.org/2001/XMLSchema-instance" xmlns:pc="http://schemas.microsoft.com/office/infopath/2007/PartnerControls">
-  <documentManagement>
-    <lcf76f155ced4ddcb4097134ff3c332f xmlns="c8a3e049-7505-4416-9a92-b091f6792637">
-      <Terms xmlns="http://schemas.microsoft.com/office/infopath/2007/PartnerControls"/>
-    </lcf76f155ced4ddcb4097134ff3c332f>
-  </documentManagement>
-</p:properties>
+<file path=customXml/itemProps1.xml><?xml version="1.0" encoding="utf-8"?>
+<ds:datastoreItem xmlns:ds="http://schemas.openxmlformats.org/officeDocument/2006/customXml" ds:itemID="{2EB862DC-4507-421A-9236-A5914849FEDC}">
+  <ds:schemaRefs>
+    <ds:schemaRef ds:uri="http://schemas.microsoft.com/sharepoint/v3/contenttype/forms"/>
+  </ds:schemaRefs>
+</ds:datastoreItem>
 </file>
 
-<file path=customXml/item3.xml><?xml version="1.0" encoding="utf-8"?>
-<?mso-contentType ?>
-<FormTemplates xmlns="http://schemas.microsoft.com/sharepoint/v3/contenttype/forms">
-  <Display>DocumentLibraryForm</Display>
-  <Edit>DocumentLibraryForm</Edit>
-  <New>DocumentLibraryForm</New>
-</FormTemplates>
+<file path=customXml/itemProps2.xml><?xml version="1.0" encoding="utf-8"?>
+<ds:datastoreItem xmlns:ds="http://schemas.openxmlformats.org/officeDocument/2006/customXml" ds:itemID="{5E8D21DD-F9D0-4D04-9C0C-B62691ED96F2}">
+  <ds:schemaRefs>
+    <ds:schemaRef ds:uri="http://schemas.microsoft.com/office/2006/metadata/properties"/>
+    <ds:schemaRef ds:uri="http://schemas.microsoft.com/office/infopath/2007/PartnerControls"/>
+    <ds:schemaRef ds:uri="c8a3e049-7505-4416-9a92-b091f6792637"/>
+  </ds:schemaRefs>
+</ds:datastoreItem>
 </file>
 
-<file path=customXml/itemProps1.xml><?xml version="1.0" encoding="utf-8"?>
+<file path=customXml/itemProps3.xml><?xml version="1.0" encoding="utf-8"?>
 <ds:datastoreItem xmlns:ds="http://schemas.openxmlformats.org/officeDocument/2006/customXml" ds:itemID="{54F3045B-D63A-4B6A-B685-E2C1A6EF62A8}">
   <ds:schemaRefs>
     <ds:schemaRef ds:uri="http://schemas.microsoft.com/office/2006/metadata/contentType"/>
@@ -2211,22 +2222,4 @@
     <ds:schemaRef ds:uri="http://schemas.microsoft.com/internal/obd"/>
   </ds:schemaRefs>
 </ds:datastoreItem>
-</file>
-
-<file path=customXml/itemProps2.xml><?xml version="1.0" encoding="utf-8"?>
-<ds:datastoreItem xmlns:ds="http://schemas.openxmlformats.org/officeDocument/2006/customXml" ds:itemID="{5E8D21DD-F9D0-4D04-9C0C-B62691ED96F2}">
-  <ds:schemaRefs>
-    <ds:schemaRef ds:uri="http://schemas.microsoft.com/office/2006/metadata/properties"/>
-    <ds:schemaRef ds:uri="http://schemas.microsoft.com/office/infopath/2007/PartnerControls"/>
-    <ds:schemaRef ds:uri="c8a3e049-7505-4416-9a92-b091f6792637"/>
-  </ds:schemaRefs>
-</ds:datastoreItem>
-</file>
-
-<file path=customXml/itemProps3.xml><?xml version="1.0" encoding="utf-8"?>
-<ds:datastoreItem xmlns:ds="http://schemas.openxmlformats.org/officeDocument/2006/customXml" ds:itemID="{2EB862DC-4507-421A-9236-A5914849FEDC}">
-  <ds:schemaRefs>
-    <ds:schemaRef ds:uri="http://schemas.microsoft.com/sharepoint/v3/contenttype/forms"/>
-  </ds:schemaRefs>
-</ds:datastoreItem>
 </file>
</xml_diff>